<commit_message>
feat: RAG eval framework with LLM-as-judge, FlashRank scores, hallucination guard
</commit_message>
<xml_diff>
--- a/Documentation/Roadmap.docx
+++ b/Documentation/Roadmap.docx
@@ -14,229 +14,454 @@
           <w:b/>
           <w:bCs/>
         </w:rPr>
-        <w:t>Session Summary — 12 April 2026</w:t>
-      </w:r>
-    </w:p>
-    <w:p>
-      <w:pPr>
-        <w:rPr>
-          <w:b/>
-          <w:bCs/>
-        </w:rPr>
-      </w:pPr>
-      <w:r>
-        <w:rPr>
-          <w:b/>
-          <w:bCs/>
-        </w:rPr>
-        <w:t>What We Built Today</w:t>
-      </w:r>
-    </w:p>
-    <w:p>
-      <w:r>
-        <w:rPr>
-          <w:b/>
-          <w:bCs/>
-        </w:rPr>
-        <w:t>1. Fixed /ask endpoint</w:t>
-      </w:r>
-    </w:p>
-    <w:p>
-      <w:pPr>
-        <w:numPr>
-          <w:ilvl w:val="0"/>
-          <w:numId w:val="1"/>
-        </w:numPr>
-      </w:pPr>
-      <w:r>
-        <w:t>Replaced Form(...) with Pydantic AskRequest model</w:t>
-      </w:r>
-    </w:p>
-    <w:p>
-      <w:pPr>
-        <w:numPr>
-          <w:ilvl w:val="0"/>
-          <w:numId w:val="1"/>
-        </w:numPr>
-      </w:pPr>
-      <w:r>
-        <w:t>Now accepts JSON — future ready</w:t>
-      </w:r>
-    </w:p>
-    <w:p>
-      <w:pPr>
-        <w:numPr>
-          <w:ilvl w:val="0"/>
-          <w:numId w:val="1"/>
-        </w:numPr>
-      </w:pPr>
-      <w:r>
-        <w:t>doc_type field reserved for future filtering</w:t>
-      </w:r>
-    </w:p>
-    <w:p>
-      <w:pPr>
-        <w:numPr>
-          <w:ilvl w:val="0"/>
-          <w:numId w:val="1"/>
-        </w:numPr>
-      </w:pPr>
-      <w:r>
-        <w:t>Tested and validated in Postman — 200 OK, correct context returned</w:t>
-      </w:r>
-    </w:p>
-    <w:p>
-      <w:r>
-        <w:rPr>
-          <w:b/>
-          <w:bCs/>
-        </w:rPr>
-        <w:t>2. MCP Server (mcp_server.py)</w:t>
-      </w:r>
-    </w:p>
-    <w:p>
-      <w:pPr>
-        <w:numPr>
-          <w:ilvl w:val="0"/>
-          <w:numId w:val="2"/>
-        </w:numPr>
-      </w:pPr>
-      <w:r>
-        <w:t>Built and connected to Claude Desktop</w:t>
-      </w:r>
-    </w:p>
-    <w:p>
-      <w:pPr>
-        <w:numPr>
-          <w:ilvl w:val="0"/>
-          <w:numId w:val="2"/>
-        </w:numPr>
-      </w:pPr>
-      <w:r>
-        <w:t>One tool exposed: ask</w:t>
-      </w:r>
-    </w:p>
-    <w:p>
-      <w:pPr>
-        <w:numPr>
-          <w:ilvl w:val="0"/>
-          <w:numId w:val="2"/>
-        </w:numPr>
-      </w:pPr>
-      <w:r>
-        <w:t>Uses httpx.post with json= — correct content type</w:t>
-      </w:r>
-    </w:p>
-    <w:p>
-      <w:pPr>
-        <w:numPr>
-          <w:ilvl w:val="0"/>
-          <w:numId w:val="2"/>
-        </w:numPr>
-      </w:pPr>
-      <w:r>
-        <w:t>Connected via claude_desktop_config.json on Windows</w:t>
-      </w:r>
-    </w:p>
-    <w:p>
-      <w:pPr>
-        <w:numPr>
-          <w:ilvl w:val="0"/>
-          <w:numId w:val="2"/>
-        </w:numPr>
-      </w:pPr>
-      <w:r>
-        <w:t>Tested live in Claude Desktop — tool fires, retrieves context, answers correctly</w:t>
-      </w:r>
-    </w:p>
-    <w:p>
-      <w:r>
-        <w:rPr>
-          <w:b/>
-          <w:bCs/>
-        </w:rPr>
-        <w:t>3. Updated supporting files</w:t>
-      </w:r>
-    </w:p>
-    <w:p>
-      <w:pPr>
-        <w:numPr>
-          <w:ilvl w:val="0"/>
-          <w:numId w:val="3"/>
-        </w:numPr>
-      </w:pPr>
-      <w:r>
-        <w:t>logger.py — new schema: value, unit, meta replacing duration_ms</w:t>
-      </w:r>
-    </w:p>
-    <w:p>
-      <w:pPr>
-        <w:numPr>
-          <w:ilvl w:val="0"/>
-          <w:numId w:val="3"/>
-        </w:numPr>
-      </w:pPr>
-      <w:r>
-        <w:t>performance_broadcaster.py — aligned to new schema, no backward compat debt</w:t>
-      </w:r>
-    </w:p>
-    <w:p>
-      <w:pPr>
-        <w:numPr>
-          <w:ilvl w:val="0"/>
-          <w:numId w:val="3"/>
-        </w:numPr>
-      </w:pPr>
-      <w:r>
-        <w:t>indexer.py — granular telemetry across 6 phases, smart summary generation with chunk sampling (first + middle + last), respects human-provided summary</w:t>
-      </w:r>
-    </w:p>
-    <w:p>
-      <w:r>
-        <w:rPr>
-          <w:b/>
-          <w:bCs/>
-        </w:rPr>
-        <w:t>4. UI improvements</w:t>
-      </w:r>
-    </w:p>
-    <w:p>
-      <w:pPr>
-        <w:numPr>
-          <w:ilvl w:val="0"/>
-          <w:numId w:val="4"/>
-        </w:numPr>
-      </w:pPr>
-      <w:r>
-        <w:t>Collapsible sidebar with chevron toggle</w:t>
-      </w:r>
-    </w:p>
-    <w:p>
-      <w:pPr>
-        <w:numPr>
-          <w:ilvl w:val="0"/>
-          <w:numId w:val="4"/>
-        </w:numPr>
-      </w:pPr>
-      <w:r>
-        <w:t>Flickering fixed via surgical DOM diffing — no more innerHTML wipe</w:t>
-      </w:r>
-    </w:p>
-    <w:p>
-      <w:pPr>
-        <w:numPr>
-          <w:ilvl w:val="0"/>
-          <w:numId w:val="4"/>
-        </w:numPr>
-      </w:pPr>
-      <w:r>
-        <w:t>Status cell updates without re-rendering the whole table</w:t>
-      </w:r>
-    </w:p>
-    <w:p>
-      <w:r>
-        <w:pict w14:anchorId="75772478">
-          <v:rect id="_x0000_i1055" style="width:0;height:1.5pt" o:hralign="center" o:hrstd="t" o:hr="t" fillcolor="#a0a0a0" stroked="f"/>
+        <w:t>What We Built Today:</w:t>
+      </w:r>
+    </w:p>
+    <w:p>
+      <w:pPr>
+        <w:rPr>
+          <w:b/>
+          <w:bCs/>
+        </w:rPr>
+      </w:pPr>
+      <w:r>
+        <w:rPr>
+          <w:rFonts w:ascii="Segoe UI Emoji" w:hAnsi="Segoe UI Emoji" w:cs="Segoe UI Emoji"/>
+          <w:b/>
+          <w:bCs/>
+        </w:rPr>
+        <w:t>✅</w:t>
+      </w:r>
+      <w:r>
+        <w:rPr>
+          <w:b/>
+          <w:bCs/>
+        </w:rPr>
+        <w:t xml:space="preserve"> /ask endpoint — JSON Pydantic model, future ready</w:t>
+      </w:r>
+    </w:p>
+    <w:p>
+      <w:pPr>
+        <w:rPr>
+          <w:b/>
+          <w:bCs/>
+        </w:rPr>
+      </w:pPr>
+      <w:r>
+        <w:rPr>
+          <w:rFonts w:ascii="Segoe UI Emoji" w:hAnsi="Segoe UI Emoji" w:cs="Segoe UI Emoji"/>
+          <w:b/>
+          <w:bCs/>
+        </w:rPr>
+        <w:t>✅</w:t>
+      </w:r>
+      <w:r>
+        <w:rPr>
+          <w:b/>
+          <w:bCs/>
+        </w:rPr>
+        <w:t xml:space="preserve"> /preview endpoint — file → extract → AI summary → UI</w:t>
+      </w:r>
+    </w:p>
+    <w:p>
+      <w:pPr>
+        <w:rPr>
+          <w:b/>
+          <w:bCs/>
+        </w:rPr>
+      </w:pPr>
+      <w:r>
+        <w:rPr>
+          <w:rFonts w:ascii="Segoe UI Emoji" w:hAnsi="Segoe UI Emoji" w:cs="Segoe UI Emoji"/>
+          <w:b/>
+          <w:bCs/>
+        </w:rPr>
+        <w:t>✅</w:t>
+      </w:r>
+      <w:r>
+        <w:rPr>
+          <w:b/>
+          <w:bCs/>
+        </w:rPr>
+        <w:t xml:space="preserve"> Auto-summary generation in indexer.py</w:t>
+      </w:r>
+    </w:p>
+    <w:p>
+      <w:pPr>
+        <w:rPr>
+          <w:b/>
+          <w:bCs/>
+        </w:rPr>
+      </w:pPr>
+      <w:r>
+        <w:rPr>
+          <w:b/>
+          <w:bCs/>
+        </w:rPr>
+        <w:t xml:space="preserve">   - gemini-3.1-flash-lite-preview</w:t>
+      </w:r>
+    </w:p>
+    <w:p>
+      <w:pPr>
+        <w:rPr>
+          <w:b/>
+          <w:bCs/>
+        </w:rPr>
+      </w:pPr>
+      <w:r>
+        <w:rPr>
+          <w:b/>
+          <w:bCs/>
+        </w:rPr>
+        <w:t xml:space="preserve">   - Strategic chunk sampling (first + middle + last)</w:t>
+      </w:r>
+    </w:p>
+    <w:p>
+      <w:pPr>
+        <w:rPr>
+          <w:b/>
+          <w:bCs/>
+        </w:rPr>
+      </w:pPr>
+      <w:r>
+        <w:rPr>
+          <w:b/>
+          <w:bCs/>
+        </w:rPr>
+        <w:t xml:space="preserve">   - Pure content summary, 5 sentences</w:t>
+      </w:r>
+    </w:p>
+    <w:p>
+      <w:pPr>
+        <w:rPr>
+          <w:b/>
+          <w:bCs/>
+        </w:rPr>
+      </w:pPr>
+      <w:r>
+        <w:rPr>
+          <w:b/>
+          <w:bCs/>
+        </w:rPr>
+        <w:t xml:space="preserve">   - Respects human-provided summary</w:t>
+      </w:r>
+    </w:p>
+    <w:p>
+      <w:pPr>
+        <w:rPr>
+          <w:b/>
+          <w:bCs/>
+        </w:rPr>
+      </w:pPr>
+      <w:r>
+        <w:rPr>
+          <w:b/>
+          <w:bCs/>
+        </w:rPr>
+        <w:t xml:space="preserve">   - Falls back gracefully on failure</w:t>
+      </w:r>
+    </w:p>
+    <w:p>
+      <w:pPr>
+        <w:rPr>
+          <w:b/>
+          <w:bCs/>
+        </w:rPr>
+      </w:pPr>
+      <w:r>
+        <w:rPr>
+          <w:rFonts w:ascii="Segoe UI Emoji" w:hAnsi="Segoe UI Emoji" w:cs="Segoe UI Emoji"/>
+          <w:b/>
+          <w:bCs/>
+        </w:rPr>
+        <w:t>✅</w:t>
+      </w:r>
+      <w:r>
+        <w:rPr>
+          <w:b/>
+          <w:bCs/>
+        </w:rPr>
+        <w:t xml:space="preserve"> UI improvements</w:t>
+      </w:r>
+    </w:p>
+    <w:p>
+      <w:pPr>
+        <w:rPr>
+          <w:b/>
+          <w:bCs/>
+        </w:rPr>
+      </w:pPr>
+      <w:r>
+        <w:rPr>
+          <w:b/>
+          <w:bCs/>
+        </w:rPr>
+        <w:t xml:space="preserve">   - Summary auto-populates on file select</w:t>
+      </w:r>
+    </w:p>
+    <w:p>
+      <w:pPr>
+        <w:rPr>
+          <w:b/>
+          <w:bCs/>
+        </w:rPr>
+      </w:pPr>
+      <w:r>
+        <w:rPr>
+          <w:b/>
+          <w:bCs/>
+        </w:rPr>
+        <w:t xml:space="preserve">   - </w:t>
+      </w:r>
+      <w:r>
+        <w:rPr>
+          <w:rFonts w:ascii="Segoe UI Emoji" w:hAnsi="Segoe UI Emoji" w:cs="Segoe UI Emoji"/>
+          <w:b/>
+          <w:bCs/>
+        </w:rPr>
+        <w:t>✨</w:t>
+      </w:r>
+      <w:r>
+        <w:rPr>
+          <w:b/>
+          <w:bCs/>
+        </w:rPr>
+        <w:t xml:space="preserve"> AI generated label</w:t>
+      </w:r>
+    </w:p>
+    <w:p>
+      <w:pPr>
+        <w:rPr>
+          <w:b/>
+          <w:bCs/>
+        </w:rPr>
+      </w:pPr>
+      <w:r>
+        <w:rPr>
+          <w:b/>
+          <w:bCs/>
+        </w:rPr>
+        <w:t xml:space="preserve">   - Fixed height textarea (max 5 rows)</w:t>
+      </w:r>
+    </w:p>
+    <w:p>
+      <w:pPr>
+        <w:rPr>
+          <w:b/>
+          <w:bCs/>
+        </w:rPr>
+      </w:pPr>
+      <w:r>
+        <w:rPr>
+          <w:b/>
+          <w:bCs/>
+        </w:rPr>
+        <w:t xml:space="preserve">   - Hover tooltip for full summary</w:t>
+      </w:r>
+    </w:p>
+    <w:p>
+      <w:pPr>
+        <w:rPr>
+          <w:b/>
+          <w:bCs/>
+        </w:rPr>
+      </w:pPr>
+      <w:r>
+        <w:rPr>
+          <w:rFonts w:ascii="Segoe UI Emoji" w:hAnsi="Segoe UI Emoji" w:cs="Segoe UI Emoji"/>
+          <w:b/>
+          <w:bCs/>
+        </w:rPr>
+        <w:t>✅</w:t>
+      </w:r>
+      <w:r>
+        <w:rPr>
+          <w:b/>
+          <w:bCs/>
+        </w:rPr>
+        <w:t xml:space="preserve"> MCP server updated</w:t>
+      </w:r>
+    </w:p>
+    <w:p>
+      <w:pPr>
+        <w:rPr>
+          <w:b/>
+          <w:bCs/>
+        </w:rPr>
+      </w:pPr>
+      <w:r>
+        <w:rPr>
+          <w:b/>
+          <w:bCs/>
+        </w:rPr>
+        <w:t xml:space="preserve">   - list_documents tool added</w:t>
+      </w:r>
+    </w:p>
+    <w:p>
+      <w:pPr>
+        <w:rPr>
+          <w:b/>
+          <w:bCs/>
+        </w:rPr>
+      </w:pPr>
+      <w:r>
+        <w:rPr>
+          <w:b/>
+          <w:bCs/>
+        </w:rPr>
+        <w:t xml:space="preserve">   - ask tool docstring made generic</w:t>
+      </w:r>
+    </w:p>
+    <w:p>
+      <w:pPr>
+        <w:rPr>
+          <w:b/>
+          <w:bCs/>
+        </w:rPr>
+      </w:pPr>
+      <w:r>
+        <w:rPr>
+          <w:b/>
+          <w:bCs/>
+        </w:rPr>
+        <w:t xml:space="preserve">   - Both tools tested and working in Claude Desktop</w:t>
+      </w:r>
+    </w:p>
+    <w:p>
+      <w:pPr>
+        <w:rPr>
+          <w:b/>
+          <w:bCs/>
+        </w:rPr>
+      </w:pPr>
+      <w:r>
+        <w:rPr>
+          <w:rFonts w:ascii="Segoe UI Emoji" w:hAnsi="Segoe UI Emoji" w:cs="Segoe UI Emoji"/>
+          <w:b/>
+          <w:bCs/>
+        </w:rPr>
+        <w:t>✅</w:t>
+      </w:r>
+      <w:r>
+        <w:rPr>
+          <w:b/>
+          <w:bCs/>
+        </w:rPr>
+        <w:t xml:space="preserve"> Two-tool agentic demo validated</w:t>
+      </w:r>
+    </w:p>
+    <w:p>
+      <w:pPr>
+        <w:rPr>
+          <w:b/>
+          <w:bCs/>
+        </w:rPr>
+      </w:pPr>
+      <w:r>
+        <w:rPr>
+          <w:b/>
+          <w:bCs/>
+        </w:rPr>
+        <w:t xml:space="preserve">   - list_documents → returns 5 docs with summaries</w:t>
+      </w:r>
+    </w:p>
+    <w:p>
+      <w:pPr>
+        <w:rPr>
+          <w:b/>
+          <w:bCs/>
+        </w:rPr>
+      </w:pPr>
+      <w:r>
+        <w:rPr>
+          <w:b/>
+          <w:bCs/>
+        </w:rPr>
+        <w:t xml:space="preserve">   - ask → retrieves precise aviation manual content</w:t>
+      </w:r>
+    </w:p>
+    <w:p>
+      <w:pPr>
+        <w:rPr>
+          <w:b/>
+          <w:bCs/>
+        </w:rPr>
+      </w:pPr>
+      <w:r>
+        <w:rPr>
+          <w:rFonts w:ascii="Segoe UI Emoji" w:hAnsi="Segoe UI Emoji" w:cs="Segoe UI Emoji"/>
+          <w:b/>
+          <w:bCs/>
+        </w:rPr>
+        <w:t>✅</w:t>
+      </w:r>
+      <w:r>
+        <w:rPr>
+          <w:b/>
+          <w:bCs/>
+        </w:rPr>
+        <w:t xml:space="preserve"> Multi-domain documents working</w:t>
+      </w:r>
+    </w:p>
+    <w:p>
+      <w:pPr>
+        <w:rPr>
+          <w:b/>
+          <w:bCs/>
+        </w:rPr>
+      </w:pPr>
+      <w:r>
+        <w:rPr>
+          <w:b/>
+          <w:bCs/>
+        </w:rPr>
+        <w:t xml:space="preserve">   - Project Zicon (3 docs)</w:t>
+      </w:r>
+    </w:p>
+    <w:p>
+      <w:pPr>
+        <w:rPr>
+          <w:b/>
+          <w:bCs/>
+        </w:rPr>
+      </w:pPr>
+      <w:r>
+        <w:rPr>
+          <w:b/>
+          <w:bCs/>
+        </w:rPr>
+        <w:t xml:space="preserve">   - Aviation manual</w:t>
+      </w:r>
+    </w:p>
+    <w:p>
+      <w:pPr>
+        <w:rPr>
+          <w:b/>
+          <w:bCs/>
+        </w:rPr>
+      </w:pPr>
+      <w:r>
+        <w:rPr>
+          <w:b/>
+          <w:bCs/>
+        </w:rPr>
+        <w:t xml:space="preserve">   - Biodiversity census</w:t>
+      </w:r>
+    </w:p>
+    <w:p>
+      <w:pPr>
+        <w:rPr>
+          <w:b/>
+          <w:bCs/>
+        </w:rPr>
+      </w:pPr>
+      <w:r>
+        <w:rPr>
+          <w:b/>
+          <w:bCs/>
+        </w:rPr>
+        <w:pict w14:anchorId="66209427">
+          <v:rect id="_x0000_i1068" style="width:0;height:1.5pt" o:hralign="center" o:hrstd="t" o:hr="t" fillcolor="#a0a0a0" stroked="f"/>
         </w:pict>
       </w:r>
     </w:p>
@@ -252,7 +477,7 @@
           <w:b/>
           <w:bCs/>
         </w:rPr>
-        <w:t>Key Decisions Made</w:t>
+        <w:t>Key Decisions Made Today:</w:t>
       </w:r>
     </w:p>
     <w:tbl>
@@ -268,8 +493,8 @@
         <w:tblLook w:val="04A0" w:firstRow="1" w:lastRow="0" w:firstColumn="1" w:lastColumn="0" w:noHBand="0" w:noVBand="1"/>
       </w:tblPr>
       <w:tblGrid>
-        <w:gridCol w:w="3978"/>
-        <w:gridCol w:w="5048"/>
+        <w:gridCol w:w="4740"/>
+        <w:gridCol w:w="2864"/>
       </w:tblGrid>
       <w:tr>
         <w:trPr>
@@ -316,7 +541,7 @@
                 <w:b/>
                 <w:bCs/>
               </w:rPr>
-              <w:t>Rationale</w:t>
+              <w:t>Reason</w:t>
             </w:r>
           </w:p>
         </w:tc>
@@ -332,8 +557,18 @@
             <w:hideMark/>
           </w:tcPr>
           <w:p>
+            <w:pPr>
+              <w:rPr>
+                <w:b/>
+                <w:bCs/>
+              </w:rPr>
+            </w:pPr>
             <w:r>
-              <w:t>/ask accepts JSON not Form</w:t>
+              <w:rPr>
+                <w:b/>
+                <w:bCs/>
+              </w:rPr>
+              <w:t>Summary never gates ask()</w:t>
             </w:r>
           </w:p>
         </w:tc>
@@ -344,8 +579,18 @@
             <w:hideMark/>
           </w:tcPr>
           <w:p>
+            <w:pPr>
+              <w:rPr>
+                <w:b/>
+                <w:bCs/>
+              </w:rPr>
+            </w:pPr>
             <w:r>
-              <w:t>Future-ready, MCP calls it cleanly</w:t>
+              <w:rPr>
+                <w:b/>
+                <w:bCs/>
+              </w:rPr>
+              <w:t>Chunks always searched in full</w:t>
             </w:r>
           </w:p>
         </w:tc>
@@ -361,8 +606,18 @@
             <w:hideMark/>
           </w:tcPr>
           <w:p>
+            <w:pPr>
+              <w:rPr>
+                <w:b/>
+                <w:bCs/>
+              </w:rPr>
+            </w:pPr>
             <w:r>
-              <w:t>Summary never gates ask()</w:t>
+              <w:rPr>
+                <w:b/>
+                <w:bCs/>
+              </w:rPr>
+              <w:t>Strategic chunk sampling over first 3000 chars</w:t>
             </w:r>
           </w:p>
         </w:tc>
@@ -373,8 +628,18 @@
             <w:hideMark/>
           </w:tcPr>
           <w:p>
+            <w:pPr>
+              <w:rPr>
+                <w:b/>
+                <w:bCs/>
+              </w:rPr>
+            </w:pPr>
             <w:r>
-              <w:t>Chunks always searched in full — summary is routing hint only</w:t>
+              <w:rPr>
+                <w:b/>
+                <w:bCs/>
+              </w:rPr>
+              <w:t>Covers full document arc</w:t>
             </w:r>
           </w:p>
         </w:tc>
@@ -390,8 +655,19 @@
             <w:hideMark/>
           </w:tcPr>
           <w:p>
+            <w:pPr>
+              <w:rPr>
+                <w:b/>
+                <w:bCs/>
+              </w:rPr>
+            </w:pPr>
             <w:r>
-              <w:t>Smart sampling over first 3000 chars</w:t>
+              <w:rPr>
+                <w:b/>
+                <w:bCs/>
+              </w:rPr>
+              <w:lastRenderedPageBreak/>
+              <w:t>gemini-3.1-flash-lite-preview for summaries</w:t>
             </w:r>
           </w:p>
         </w:tc>
@@ -402,8 +678,18 @@
             <w:hideMark/>
           </w:tcPr>
           <w:p>
+            <w:pPr>
+              <w:rPr>
+                <w:b/>
+                <w:bCs/>
+              </w:rPr>
+            </w:pPr>
             <w:r>
-              <w:t>Covers beginning + middle + end of any document</w:t>
+              <w:rPr>
+                <w:b/>
+                <w:bCs/>
+              </w:rPr>
+              <w:t>Available on your API key</w:t>
             </w:r>
           </w:p>
         </w:tc>
@@ -419,8 +705,18 @@
             <w:hideMark/>
           </w:tcPr>
           <w:p>
+            <w:pPr>
+              <w:rPr>
+                <w:b/>
+                <w:bCs/>
+              </w:rPr>
+            </w:pPr>
             <w:r>
-              <w:t>Respect human summary if provided</w:t>
+              <w:rPr>
+                <w:b/>
+                <w:bCs/>
+              </w:rPr>
+              <w:t>Skip LangGraph for now</w:t>
             </w:r>
           </w:p>
         </w:tc>
@@ -431,8 +727,18 @@
             <w:hideMark/>
           </w:tcPr>
           <w:p>
+            <w:pPr>
+              <w:rPr>
+                <w:b/>
+                <w:bCs/>
+              </w:rPr>
+            </w:pPr>
             <w:r>
-              <w:t>AI fills gap only when blank</w:t>
+              <w:rPr>
+                <w:b/>
+                <w:bCs/>
+              </w:rPr>
+              <w:t>No problem that justifies it yet</w:t>
             </w:r>
           </w:p>
         </w:tc>
@@ -448,9 +754,18 @@
             <w:hideMark/>
           </w:tcPr>
           <w:p>
+            <w:pPr>
+              <w:rPr>
+                <w:b/>
+                <w:bCs/>
+              </w:rPr>
+            </w:pPr>
             <w:r>
-              <w:lastRenderedPageBreak/>
-              <w:t>list_documents over get_document_metadata</w:t>
+              <w:rPr>
+                <w:b/>
+                <w:bCs/>
+              </w:rPr>
+              <w:t>Threading queue before LangGraph for bulk upload</w:t>
             </w:r>
           </w:p>
         </w:tc>
@@ -461,8 +776,18 @@
             <w:hideMark/>
           </w:tcPr>
           <w:p>
+            <w:pPr>
+              <w:rPr>
+                <w:b/>
+                <w:bCs/>
+              </w:rPr>
+            </w:pPr>
             <w:r>
-              <w:t>More agentic — Claude decides routing</w:t>
+              <w:rPr>
+                <w:b/>
+                <w:bCs/>
+              </w:rPr>
+              <w:t>Simplest solution first</w:t>
             </w:r>
           </w:p>
         </w:tc>
@@ -478,8 +803,18 @@
             <w:hideMark/>
           </w:tcPr>
           <w:p>
+            <w:pPr>
+              <w:rPr>
+                <w:b/>
+                <w:bCs/>
+              </w:rPr>
+            </w:pPr>
             <w:r>
-              <w:t>Two-step upload for preview summary</w:t>
+              <w:rPr>
+                <w:b/>
+                <w:bCs/>
+              </w:rPr>
+              <w:t>Evals before analytics</w:t>
             </w:r>
           </w:p>
         </w:tc>
@@ -490,46 +825,37 @@
             <w:hideMark/>
           </w:tcPr>
           <w:p>
+            <w:pPr>
+              <w:rPr>
+                <w:b/>
+                <w:bCs/>
+              </w:rPr>
+            </w:pPr>
             <w:r>
-              <w:t>Clean UX, reuses existing extract + generate functions</w:t>
-            </w:r>
-          </w:p>
-        </w:tc>
-      </w:tr>
-      <w:tr>
-        <w:trPr>
-          <w:tblCellSpacing w:w="15" w:type="dxa"/>
-        </w:trPr>
-        <w:tc>
-          <w:tcPr>
-            <w:tcW w:w="0" w:type="auto"/>
-            <w:vAlign w:val="center"/>
-            <w:hideMark/>
-          </w:tcPr>
-          <w:p>
-            <w:r>
-              <w:t>MCP server as stdio child process</w:t>
-            </w:r>
-          </w:p>
-        </w:tc>
-        <w:tc>
-          <w:tcPr>
-            <w:tcW w:w="0" w:type="auto"/>
-            <w:vAlign w:val="center"/>
-            <w:hideMark/>
-          </w:tcPr>
-          <w:p>
-            <w:r>
-              <w:t>Claude Desktop spawns it, not HTTP</w:t>
+              <w:rPr>
+                <w:b/>
+                <w:bCs/>
+              </w:rPr>
+              <w:t>Quality before visibility</w:t>
             </w:r>
           </w:p>
         </w:tc>
       </w:tr>
     </w:tbl>
     <w:p>
-      <w:r>
-        <w:pict w14:anchorId="76BF0826">
-          <v:rect id="_x0000_i1056" style="width:0;height:1.5pt" o:hralign="center" o:hrstd="t" o:hr="t" fillcolor="#a0a0a0" stroked="f"/>
+      <w:pPr>
+        <w:rPr>
+          <w:b/>
+          <w:bCs/>
+        </w:rPr>
+      </w:pPr>
+      <w:r>
+        <w:rPr>
+          <w:b/>
+          <w:bCs/>
+        </w:rPr>
+        <w:pict w14:anchorId="0AE08898">
+          <v:rect id="_x0000_i1069" style="width:0;height:1.5pt" o:hralign="center" o:hrstd="t" o:hr="t" fillcolor="#a0a0a0" stroked="f"/>
         </w:pict>
       </w:r>
     </w:p>
@@ -545,737 +871,590 @@
           <w:b/>
           <w:bCs/>
         </w:rPr>
-        <w:t>Roadmap</w:t>
-      </w:r>
-    </w:p>
-    <w:p>
-      <w:r>
-        <w:rPr>
-          <w:b/>
-          <w:bCs/>
-        </w:rPr>
-        <w:t>This week — Complete Agentic Layer:</w:t>
-      </w:r>
-    </w:p>
-    <w:p>
+        <w:t>Roadmap — Next Session Priority:</w:t>
+      </w:r>
+    </w:p>
+    <w:p>
+      <w:pPr>
+        <w:rPr>
+          <w:b/>
+          <w:bCs/>
+        </w:rPr>
+      </w:pPr>
+      <w:r>
+        <w:rPr>
+          <w:b/>
+          <w:bCs/>
+        </w:rPr>
+        <w:t>NEXT SESSION</w:t>
+      </w:r>
+    </w:p>
+    <w:p>
+      <w:pPr>
+        <w:rPr>
+          <w:b/>
+          <w:bCs/>
+        </w:rPr>
+      </w:pPr>
       <w:r>
         <w:rPr>
           <w:rFonts w:ascii="Segoe UI Emoji" w:hAnsi="Segoe UI Emoji" w:cs="Segoe UI Emoji"/>
+          <w:b/>
+          <w:bCs/>
         </w:rPr>
         <w:t>🔲</w:t>
       </w:r>
       <w:r>
-        <w:t xml:space="preserve"> /preview endpoint (extract + summarise before upload)</w:t>
-      </w:r>
-    </w:p>
-    <w:p>
+        <w:rPr>
+          <w:b/>
+          <w:bCs/>
+        </w:rPr>
+        <w:t xml:space="preserve"> RAG Evaluation Framework</w:t>
+      </w:r>
+    </w:p>
+    <w:p>
+      <w:pPr>
+        <w:rPr>
+          <w:b/>
+          <w:bCs/>
+        </w:rPr>
+      </w:pPr>
+      <w:r>
+        <w:rPr>
+          <w:b/>
+          <w:bCs/>
+        </w:rPr>
+        <w:t xml:space="preserve">   - Build question set (simple, multi-hop, negative, cross-doc)</w:t>
+      </w:r>
+    </w:p>
+    <w:p>
+      <w:pPr>
+        <w:rPr>
+          <w:b/>
+          <w:bCs/>
+        </w:rPr>
+      </w:pPr>
+      <w:r>
+        <w:rPr>
+          <w:b/>
+          <w:bCs/>
+        </w:rPr>
+        <w:t xml:space="preserve">   - Define ground truth answers</w:t>
+      </w:r>
+    </w:p>
+    <w:p>
+      <w:pPr>
+        <w:rPr>
+          <w:b/>
+          <w:bCs/>
+        </w:rPr>
+      </w:pPr>
+      <w:r>
+        <w:rPr>
+          <w:b/>
+          <w:bCs/>
+        </w:rPr>
+        <w:t xml:space="preserve">   - Score retrieval quality (hit rate, faithfulness, relevance)</w:t>
+      </w:r>
+    </w:p>
+    <w:p>
+      <w:pPr>
+        <w:rPr>
+          <w:b/>
+          <w:bCs/>
+        </w:rPr>
+      </w:pPr>
+      <w:r>
+        <w:rPr>
+          <w:b/>
+          <w:bCs/>
+        </w:rPr>
+        <w:t xml:space="preserve">   - Hybrid eval (you judge + Gemini judges)</w:t>
+      </w:r>
+    </w:p>
+    <w:p>
+      <w:pPr>
+        <w:rPr>
+          <w:b/>
+          <w:bCs/>
+        </w:rPr>
+      </w:pPr>
+      <w:r>
+        <w:rPr>
+          <w:b/>
+          <w:bCs/>
+        </w:rPr>
+        <w:t xml:space="preserve">   - Tune based on findings</w:t>
+      </w:r>
+    </w:p>
+    <w:p>
+      <w:pPr>
+        <w:rPr>
+          <w:b/>
+          <w:bCs/>
+        </w:rPr>
+      </w:pPr>
+    </w:p>
+    <w:p>
+      <w:pPr>
+        <w:rPr>
+          <w:b/>
+          <w:bCs/>
+        </w:rPr>
+      </w:pPr>
+      <w:r>
+        <w:rPr>
+          <w:b/>
+          <w:bCs/>
+        </w:rPr>
+        <w:t>SOON AFTER</w:t>
+      </w:r>
+    </w:p>
+    <w:p>
+      <w:pPr>
+        <w:rPr>
+          <w:b/>
+          <w:bCs/>
+        </w:rPr>
+      </w:pPr>
       <w:r>
         <w:rPr>
           <w:rFonts w:ascii="Segoe UI Emoji" w:hAnsi="Segoe UI Emoji" w:cs="Segoe UI Emoji"/>
+          <w:b/>
+          <w:bCs/>
         </w:rPr>
         <w:t>🔲</w:t>
       </w:r>
       <w:r>
-        <w:t xml:space="preserve"> Smart summary generation (chunk sampling)</w:t>
-      </w:r>
-    </w:p>
-    <w:p>
+        <w:rPr>
+          <w:b/>
+          <w:bCs/>
+        </w:rPr>
+        <w:t xml:space="preserve"> Analytics dashboard on granular_performance.csv</w:t>
+      </w:r>
+    </w:p>
+    <w:p>
+      <w:pPr>
+        <w:rPr>
+          <w:b/>
+          <w:bCs/>
+        </w:rPr>
+      </w:pPr>
       <w:r>
         <w:rPr>
           <w:rFonts w:ascii="Segoe UI Emoji" w:hAnsi="Segoe UI Emoji" w:cs="Segoe UI Emoji"/>
+          <w:b/>
+          <w:bCs/>
         </w:rPr>
         <w:t>🔲</w:t>
       </w:r>
       <w:r>
-        <w:t xml:space="preserve"> UI changes — auto-populate summary box, row 5 max, </w:t>
-      </w:r>
-    </w:p>
-    <w:p>
-      <w:r>
-        <w:t xml:space="preserve">               AI generated label, hover for full text</w:t>
-      </w:r>
-    </w:p>
-    <w:p>
+        <w:rPr>
+          <w:b/>
+          <w:bCs/>
+        </w:rPr>
+        <w:t xml:space="preserve"> Flickering fix — deploy the DOM diff index.html</w:t>
+      </w:r>
+    </w:p>
+    <w:p>
+      <w:pPr>
+        <w:rPr>
+          <w:b/>
+          <w:bCs/>
+        </w:rPr>
+      </w:pPr>
+    </w:p>
+    <w:p>
+      <w:pPr>
+        <w:rPr>
+          <w:b/>
+          <w:bCs/>
+        </w:rPr>
+      </w:pPr>
+      <w:r>
+        <w:rPr>
+          <w:b/>
+          <w:bCs/>
+        </w:rPr>
+        <w:t>LATER</w:t>
+      </w:r>
+    </w:p>
+    <w:p>
+      <w:pPr>
+        <w:rPr>
+          <w:b/>
+          <w:bCs/>
+        </w:rPr>
+      </w:pPr>
       <w:r>
         <w:rPr>
           <w:rFonts w:ascii="Segoe UI Emoji" w:hAnsi="Segoe UI Emoji" w:cs="Segoe UI Emoji"/>
+          <w:b/>
+          <w:bCs/>
         </w:rPr>
         <w:t>🔲</w:t>
       </w:r>
       <w:r>
-        <w:t xml:space="preserve"> list_documents MCP tool (second tool)</w:t>
-      </w:r>
-    </w:p>
-    <w:p>
+        <w:rPr>
+          <w:b/>
+          <w:bCs/>
+        </w:rPr>
+        <w:t xml:space="preserve"> Bulk upload — threading queue first</w:t>
+      </w:r>
+    </w:p>
+    <w:p>
+      <w:pPr>
+        <w:rPr>
+          <w:b/>
+          <w:bCs/>
+        </w:rPr>
+      </w:pPr>
       <w:r>
         <w:rPr>
           <w:rFonts w:ascii="Segoe UI Emoji" w:hAnsi="Segoe UI Emoji" w:cs="Segoe UI Emoji"/>
+          <w:b/>
+          <w:bCs/>
         </w:rPr>
         <w:t>🔲</w:t>
       </w:r>
       <w:r>
-        <w:t xml:space="preserve"> Two-tool agentic demo in Claude Desktop</w:t>
-      </w:r>
-    </w:p>
-    <w:p>
+        <w:rPr>
+          <w:b/>
+          <w:bCs/>
+        </w:rPr>
+        <w:t xml:space="preserve"> LangGraph — when bulk needs intelligence</w:t>
+      </w:r>
+    </w:p>
+    <w:p>
+      <w:pPr>
+        <w:rPr>
+          <w:b/>
+          <w:bCs/>
+        </w:rPr>
+      </w:pPr>
       <w:r>
         <w:rPr>
           <w:rFonts w:ascii="Segoe UI Emoji" w:hAnsi="Segoe UI Emoji" w:cs="Segoe UI Emoji"/>
+          <w:b/>
+          <w:bCs/>
         </w:rPr>
         <w:t>🔲</w:t>
       </w:r>
       <w:r>
-        <w:t xml:space="preserve"> Project setup in Claude Desktop for demo</w:t>
-      </w:r>
-    </w:p>
-    <w:p>
-      <w:r>
-        <w:rPr>
-          <w:b/>
-          <w:bCs/>
-        </w:rPr>
-        <w:t>Next week — RAG Evaluation (prioritised over analytics):</w:t>
-      </w:r>
-    </w:p>
-    <w:p>
+        <w:rPr>
+          <w:b/>
+          <w:bCs/>
+        </w:rPr>
+        <w:t xml:space="preserve"> Memory management strategy</w:t>
+      </w:r>
+    </w:p>
+    <w:p>
+      <w:pPr>
+        <w:rPr>
+          <w:b/>
+          <w:bCs/>
+        </w:rPr>
+      </w:pPr>
+      <w:r>
+        <w:rPr>
+          <w:b/>
+          <w:bCs/>
+        </w:rPr>
+        <w:pict w14:anchorId="62E4DC53">
+          <v:rect id="_x0000_i1070" style="width:0;height:1.5pt" o:hralign="center" o:hrstd="t" o:hr="t" fillcolor="#a0a0a0" stroked="f"/>
+        </w:pict>
+      </w:r>
+    </w:p>
+    <w:p>
+      <w:pPr>
+        <w:rPr>
+          <w:b/>
+          <w:bCs/>
+        </w:rPr>
+      </w:pPr>
+      <w:r>
+        <w:rPr>
+          <w:b/>
+          <w:bCs/>
+        </w:rPr>
+        <w:t>Parking Lot:</w:t>
+      </w:r>
+    </w:p>
+    <w:p>
+      <w:pPr>
+        <w:rPr>
+          <w:b/>
+          <w:bCs/>
+        </w:rPr>
+      </w:pPr>
       <w:r>
         <w:rPr>
           <w:rFonts w:ascii="Segoe UI Emoji" w:hAnsi="Segoe UI Emoji" w:cs="Segoe UI Emoji"/>
+          <w:b/>
+          <w:bCs/>
         </w:rPr>
         <w:t>🔲</w:t>
       </w:r>
       <w:r>
-        <w:t xml:space="preserve"> Build evaluation question set against your 3 docs</w:t>
-      </w:r>
-    </w:p>
-    <w:p>
+        <w:rPr>
+          <w:b/>
+          <w:bCs/>
+        </w:rPr>
+        <w:t xml:space="preserve"> Level 2 Map-Reduce summarisation (long documents)</w:t>
+      </w:r>
+    </w:p>
+    <w:p>
+      <w:pPr>
+        <w:rPr>
+          <w:b/>
+          <w:bCs/>
+        </w:rPr>
+      </w:pPr>
       <w:r>
         <w:rPr>
           <w:rFonts w:ascii="Segoe UI Emoji" w:hAnsi="Segoe UI Emoji" w:cs="Segoe UI Emoji"/>
+          <w:b/>
+          <w:bCs/>
         </w:rPr>
         <w:t>🔲</w:t>
       </w:r>
       <w:r>
-        <w:t xml:space="preserve"> Measure retrieval accuracy per question</w:t>
-      </w:r>
-    </w:p>
-    <w:p>
+        <w:rPr>
+          <w:b/>
+          <w:bCs/>
+        </w:rPr>
+        <w:t xml:space="preserve"> Long document strategy</w:t>
+      </w:r>
+    </w:p>
+    <w:p>
+      <w:pPr>
+        <w:rPr>
+          <w:b/>
+          <w:bCs/>
+        </w:rPr>
+      </w:pPr>
       <w:r>
         <w:rPr>
           <w:rFonts w:ascii="Segoe UI Emoji" w:hAnsi="Segoe UI Emoji" w:cs="Segoe UI Emoji"/>
+          <w:b/>
+          <w:bCs/>
         </w:rPr>
         <w:t>🔲</w:t>
       </w:r>
       <w:r>
-        <w:t xml:space="preserve"> Tune chunking strategy (size, overlap)</w:t>
-      </w:r>
-    </w:p>
-    <w:p>
+        <w:rPr>
+          <w:b/>
+          <w:bCs/>
+        </w:rPr>
+        <w:t xml:space="preserve"> Documents with images (Gemini Vision)</w:t>
+      </w:r>
+    </w:p>
+    <w:p>
+      <w:pPr>
+        <w:rPr>
+          <w:b/>
+          <w:bCs/>
+        </w:rPr>
+      </w:pPr>
       <w:r>
         <w:rPr>
           <w:rFonts w:ascii="Segoe UI Emoji" w:hAnsi="Segoe UI Emoji" w:cs="Segoe UI Emoji"/>
+          <w:b/>
+          <w:bCs/>
         </w:rPr>
         <w:t>🔲</w:t>
       </w:r>
       <w:r>
-        <w:t xml:space="preserve"> Tune reranker threshold</w:t>
-      </w:r>
-    </w:p>
-    <w:p>
+        <w:rPr>
+          <w:b/>
+          <w:bCs/>
+        </w:rPr>
+        <w:t xml:space="preserve"> Audio/Video ingestion</w:t>
+      </w:r>
+    </w:p>
+    <w:p>
+      <w:pPr>
+        <w:rPr>
+          <w:b/>
+          <w:bCs/>
+        </w:rPr>
+      </w:pPr>
       <w:r>
         <w:rPr>
           <w:rFonts w:ascii="Segoe UI Emoji" w:hAnsi="Segoe UI Emoji" w:cs="Segoe UI Emoji"/>
-        </w:rPr>
-        <w:t>🔲</w:t>
-      </w:r>
-      <w:r>
-        <w:t xml:space="preserve"> Compare before/after metrics</w:t>
-      </w:r>
-    </w:p>
-    <w:p>
-      <w:r>
-        <w:rPr>
-          <w:rFonts w:ascii="Segoe UI Emoji" w:hAnsi="Segoe UI Emoji" w:cs="Segoe UI Emoji"/>
-        </w:rPr>
-        <w:t>🔲</w:t>
-      </w:r>
-      <w:r>
-        <w:t xml:space="preserve"> Document findings</w:t>
-      </w:r>
-    </w:p>
-    <w:p>
-      <w:r>
-        <w:rPr>
-          <w:b/>
-          <w:bCs/>
-        </w:rPr>
-        <w:t>Week after — Analytics Dashboard:</w:t>
-      </w:r>
-    </w:p>
-    <w:p>
-      <w:r>
-        <w:rPr>
-          <w:rFonts w:ascii="Segoe UI Emoji" w:hAnsi="Segoe UI Emoji" w:cs="Segoe UI Emoji"/>
-        </w:rPr>
-        <w:t>🔲</w:t>
-      </w:r>
-      <w:r>
-        <w:t xml:space="preserve"> Read granular_performance.csv</w:t>
-      </w:r>
-    </w:p>
-    <w:p>
-      <w:r>
-        <w:rPr>
-          <w:rFonts w:ascii="Segoe UI Emoji" w:hAnsi="Segoe UI Emoji" w:cs="Segoe UI Emoji"/>
-        </w:rPr>
-        <w:t>🔲</w:t>
-      </w:r>
-      <w:r>
-        <w:t xml:space="preserve"> Per-document pipeline breakdown</w:t>
-      </w:r>
-    </w:p>
-    <w:p>
-      <w:r>
-        <w:rPr>
-          <w:rFonts w:ascii="Segoe UI Emoji" w:hAnsi="Segoe UI Emoji" w:cs="Segoe UI Emoji"/>
-        </w:rPr>
-        <w:t>🔲</w:t>
-      </w:r>
-      <w:r>
-        <w:t xml:space="preserve"> Embedding throughput charts</w:t>
-      </w:r>
-    </w:p>
-    <w:p>
-      <w:r>
-        <w:rPr>
-          <w:rFonts w:ascii="Segoe UI Emoji" w:hAnsi="Segoe UI Emoji" w:cs="Segoe UI Emoji"/>
-        </w:rPr>
-        <w:t>🔲</w:t>
-      </w:r>
-      <w:r>
-        <w:t xml:space="preserve"> Phase timing visualisation</w:t>
-      </w:r>
-    </w:p>
-    <w:p>
-      <w:r>
-        <w:rPr>
-          <w:rFonts w:ascii="Segoe UI Emoji" w:hAnsi="Segoe UI Emoji" w:cs="Segoe UI Emoji"/>
-        </w:rPr>
-        <w:t>🔲</w:t>
-      </w:r>
-      <w:r>
-        <w:t xml:space="preserve"> Batch utilisation</w:t>
-      </w:r>
-    </w:p>
-    <w:p>
-      <w:r>
-        <w:pict w14:anchorId="19A8A40D">
-          <v:rect id="_x0000_i1057" style="width:0;height:1.5pt" o:hralign="center" o:hrstd="t" o:hr="t" fillcolor="#a0a0a0" stroked="f"/>
-        </w:pict>
-      </w:r>
-    </w:p>
-    <w:p>
-      <w:pPr>
-        <w:rPr>
-          <w:b/>
-          <w:bCs/>
-        </w:rPr>
-      </w:pPr>
-      <w:r>
-        <w:rPr>
-          <w:b/>
-          <w:bCs/>
-        </w:rPr>
-        <w:t>Parking Lot</w:t>
-      </w:r>
-    </w:p>
-    <w:p>
-      <w:r>
-        <w:rPr>
-          <w:rFonts w:ascii="Segoe UI Emoji" w:hAnsi="Segoe UI Emoji" w:cs="Segoe UI Emoji"/>
+          <w:b/>
+          <w:bCs/>
         </w:rPr>
         <w:lastRenderedPageBreak/>
         <w:t>🔲</w:t>
       </w:r>
       <w:r>
-        <w:t xml:space="preserve"> Level 2 Map-Reduce summarisation (true long doc coverage)</w:t>
-      </w:r>
-    </w:p>
-    <w:p>
+        <w:rPr>
+          <w:b/>
+          <w:bCs/>
+        </w:rPr>
+        <w:t xml:space="preserve"> top_k configurable in /ask</w:t>
+      </w:r>
+    </w:p>
+    <w:p>
+      <w:pPr>
+        <w:rPr>
+          <w:b/>
+          <w:bCs/>
+        </w:rPr>
+      </w:pPr>
       <w:r>
         <w:rPr>
           <w:rFonts w:ascii="Segoe UI Emoji" w:hAnsi="Segoe UI Emoji" w:cs="Segoe UI Emoji"/>
+          <w:b/>
+          <w:bCs/>
         </w:rPr>
         <w:t>🔲</w:t>
       </w:r>
       <w:r>
-        <w:t xml:space="preserve"> Long document strategy (chunking, hierarchical summarisation)</w:t>
-      </w:r>
-    </w:p>
-    <w:p>
+        <w:rPr>
+          <w:b/>
+          <w:bCs/>
+        </w:rPr>
+        <w:t xml:space="preserve"> Human-editable summaries via UI (PUT /update-summary)</w:t>
+      </w:r>
+    </w:p>
+    <w:p>
+      <w:pPr>
+        <w:rPr>
+          <w:b/>
+          <w:bCs/>
+        </w:rPr>
+      </w:pPr>
       <w:r>
         <w:rPr>
           <w:rFonts w:ascii="Segoe UI Emoji" w:hAnsi="Segoe UI Emoji" w:cs="Segoe UI Emoji"/>
+          <w:b/>
+          <w:bCs/>
         </w:rPr>
         <w:t>🔲</w:t>
       </w:r>
       <w:r>
-        <w:t xml:space="preserve"> Documents with images (Gemini Vision at extraction time)</w:t>
-      </w:r>
-    </w:p>
-    <w:p>
+        <w:rPr>
+          <w:b/>
+          <w:bCs/>
+        </w:rPr>
+        <w:t xml:space="preserve"> Multi-project / multi-tenant scoping</w:t>
+      </w:r>
+    </w:p>
+    <w:p>
+      <w:pPr>
+        <w:rPr>
+          <w:b/>
+          <w:bCs/>
+        </w:rPr>
+      </w:pPr>
       <w:r>
         <w:rPr>
           <w:rFonts w:ascii="Segoe UI Emoji" w:hAnsi="Segoe UI Emoji" w:cs="Segoe UI Emoji"/>
+          <w:b/>
+          <w:bCs/>
         </w:rPr>
         <w:t>🔲</w:t>
       </w:r>
       <w:r>
-        <w:t xml:space="preserve"> Audio/Video ingestion (Gemini native, time-segment chunking)</w:t>
-      </w:r>
-    </w:p>
-    <w:p>
+        <w:rPr>
+          <w:b/>
+          <w:bCs/>
+        </w:rPr>
+        <w:t xml:space="preserve"> Summary as pre-filter at 50+ document scale</w:t>
+      </w:r>
+    </w:p>
+    <w:p>
+      <w:pPr>
+        <w:rPr>
+          <w:b/>
+          <w:bCs/>
+        </w:rPr>
+      </w:pPr>
       <w:r>
         <w:rPr>
           <w:rFonts w:ascii="Segoe UI Emoji" w:hAnsi="Segoe UI Emoji" w:cs="Segoe UI Emoji"/>
+          <w:b/>
+          <w:bCs/>
         </w:rPr>
         <w:t>🔲</w:t>
       </w:r>
       <w:r>
-        <w:t xml:space="preserve"> top_k as configurable parameter wired through /ask</w:t>
-      </w:r>
-    </w:p>
-    <w:p>
+        <w:rPr>
+          <w:b/>
+          <w:bCs/>
+        </w:rPr>
+        <w:t xml:space="preserve"> LangGraph for supervised bulk processing</w:t>
+      </w:r>
+    </w:p>
+    <w:p>
+      <w:pPr>
+        <w:rPr>
+          <w:b/>
+          <w:bCs/>
+        </w:rPr>
+      </w:pPr>
       <w:r>
         <w:rPr>
           <w:rFonts w:ascii="Segoe UI Emoji" w:hAnsi="Segoe UI Emoji" w:cs="Segoe UI Emoji"/>
+          <w:b/>
+          <w:bCs/>
         </w:rPr>
         <w:t>🔲</w:t>
       </w:r>
       <w:r>
-        <w:t xml:space="preserve"> Human-editable summaries via UI (PUT /update-summary endpoint)</w:t>
-      </w:r>
-    </w:p>
-    <w:p>
+        <w:rPr>
+          <w:b/>
+          <w:bCs/>
+        </w:rPr>
+        <w:t xml:space="preserve"> Celery + Redis for async task queue</w:t>
+      </w:r>
+    </w:p>
+    <w:p>
+      <w:pPr>
+        <w:rPr>
+          <w:b/>
+          <w:bCs/>
+        </w:rPr>
+      </w:pPr>
       <w:r>
         <w:rPr>
           <w:rFonts w:ascii="Segoe UI Emoji" w:hAnsi="Segoe UI Emoji" w:cs="Segoe UI Emoji"/>
+          <w:b/>
+          <w:bCs/>
         </w:rPr>
         <w:t>🔲</w:t>
       </w:r>
       <w:r>
-        <w:t xml:space="preserve"> get_document_metadata as standalone tool (future)</w:t>
-      </w:r>
-    </w:p>
-    <w:p>
+        <w:rPr>
+          <w:b/>
+          <w:bCs/>
+        </w:rPr>
+        <w:t xml:space="preserve"> Memory management (stateless /ask → stateful)</w:t>
+      </w:r>
+    </w:p>
+    <w:p>
+      <w:pPr>
+        <w:rPr>
+          <w:b/>
+          <w:bCs/>
+        </w:rPr>
+      </w:pPr>
       <w:r>
         <w:rPr>
           <w:rFonts w:ascii="Segoe UI Emoji" w:hAnsi="Segoe UI Emoji" w:cs="Segoe UI Emoji"/>
+          <w:b/>
+          <w:bCs/>
         </w:rPr>
         <w:t>🔲</w:t>
       </w:r>
       <w:r>
-        <w:t xml:space="preserve"> Multi-project / multi-tenant document scoping</w:t>
-      </w:r>
-    </w:p>
-    <w:p>
-      <w:r>
-        <w:rPr>
-          <w:rFonts w:ascii="Segoe UI Emoji" w:hAnsi="Segoe UI Emoji" w:cs="Segoe UI Emoji"/>
-        </w:rPr>
-        <w:t>🔲</w:t>
-      </w:r>
-      <w:r>
-        <w:t xml:space="preserve"> Summary as pre-filter at 50+ document scale</w:t>
-      </w:r>
-    </w:p>
-    <w:p>
-      <w:r>
-        <w:rPr>
-          <w:rFonts w:ascii="Segoe UI Emoji" w:hAnsi="Segoe UI Emoji" w:cs="Segoe UI Emoji"/>
-        </w:rPr>
-        <w:t>🔲</w:t>
-      </w:r>
-      <w:r>
-        <w:t xml:space="preserve"> Source attribution in answers using summary context</w:t>
-      </w:r>
-    </w:p>
-    <w:p>
-      <w:r>
-        <w:pict w14:anchorId="75AA3F24">
-          <v:rect id="_x0000_i1058" style="width:0;height:1.5pt" o:hralign="center" o:hrstd="t" o:hr="t" fillcolor="#a0a0a0" stroked="f"/>
-        </w:pict>
-      </w:r>
-    </w:p>
-    <w:p>
-      <w:pPr>
-        <w:rPr>
-          <w:b/>
-          <w:bCs/>
-        </w:rPr>
-      </w:pPr>
-      <w:r>
-        <w:rPr>
-          <w:b/>
-          <w:bCs/>
-        </w:rPr>
-        <w:t>Architecture State — End of Today</w:t>
-      </w:r>
-    </w:p>
-    <w:p>
-      <w:r>
-        <w:t>Browser UI (index.html)</w:t>
-      </w:r>
-    </w:p>
-    <w:p>
-      <w:r>
-        <w:t xml:space="preserve">    ↓ upload / search / library</w:t>
-      </w:r>
-    </w:p>
-    <w:p>
-      <w:r>
-        <w:t>FastAPI Backend (main.py)</w:t>
-      </w:r>
-    </w:p>
-    <w:p>
-      <w:r>
-        <w:t xml:space="preserve">    </w:t>
-      </w:r>
-      <w:r>
-        <w:rPr>
-          <w:rFonts w:ascii="MS Gothic" w:eastAsia="MS Gothic" w:hAnsi="MS Gothic" w:cs="MS Gothic" w:hint="eastAsia"/>
-        </w:rPr>
-        <w:t>├</w:t>
-      </w:r>
-      <w:r>
-        <w:rPr>
-          <w:rFonts w:ascii="Calibri" w:hAnsi="Calibri" w:cs="Calibri"/>
-        </w:rPr>
-        <w:t>──</w:t>
-      </w:r>
-      <w:r>
-        <w:t xml:space="preserve"> /upload      </w:t>
-      </w:r>
-      <w:r>
-        <w:rPr>
-          <w:rFonts w:ascii="Calibri" w:hAnsi="Calibri" w:cs="Calibri"/>
-        </w:rPr>
-        <w:t>→</w:t>
-      </w:r>
-      <w:r>
-        <w:t xml:space="preserve"> saves file + triggers indexing</w:t>
-      </w:r>
-    </w:p>
-    <w:p>
-      <w:r>
-        <w:t xml:space="preserve">    </w:t>
-      </w:r>
-      <w:r>
-        <w:rPr>
-          <w:rFonts w:ascii="MS Gothic" w:eastAsia="MS Gothic" w:hAnsi="MS Gothic" w:cs="MS Gothic" w:hint="eastAsia"/>
-        </w:rPr>
-        <w:t>├</w:t>
-      </w:r>
-      <w:r>
-        <w:rPr>
-          <w:rFonts w:ascii="Calibri" w:hAnsi="Calibri" w:cs="Calibri"/>
-        </w:rPr>
-        <w:t>──</w:t>
-      </w:r>
-      <w:r>
-        <w:t xml:space="preserve"> /ask         → JSON in, RAG pipeline, context out  </w:t>
-      </w:r>
-      <w:r>
-        <w:rPr>
-          <w:rFonts w:ascii="Segoe UI Emoji" w:hAnsi="Segoe UI Emoji" w:cs="Segoe UI Emoji"/>
-        </w:rPr>
-        <w:t>✅</w:t>
-      </w:r>
-      <w:r>
-        <w:t xml:space="preserve"> fixed today</w:t>
-      </w:r>
-    </w:p>
-    <w:p>
-      <w:r>
-        <w:t xml:space="preserve">    </w:t>
-      </w:r>
-      <w:r>
-        <w:rPr>
-          <w:rFonts w:ascii="MS Gothic" w:eastAsia="MS Gothic" w:hAnsi="MS Gothic" w:cs="MS Gothic" w:hint="eastAsia"/>
-        </w:rPr>
-        <w:t>├</w:t>
-      </w:r>
-      <w:r>
-        <w:rPr>
-          <w:rFonts w:ascii="Calibri" w:hAnsi="Calibri" w:cs="Calibri"/>
-        </w:rPr>
-        <w:t>──</w:t>
-      </w:r>
-      <w:r>
-        <w:t xml:space="preserve"> /search      </w:t>
-      </w:r>
-      <w:r>
-        <w:rPr>
-          <w:rFonts w:ascii="Calibri" w:hAnsi="Calibri" w:cs="Calibri"/>
-        </w:rPr>
-        <w:t>→</w:t>
-      </w:r>
-      <w:r>
-        <w:t xml:space="preserve"> BTree + FTS5 keyword search</w:t>
-      </w:r>
-    </w:p>
-    <w:p>
-      <w:r>
-        <w:t xml:space="preserve">    </w:t>
-      </w:r>
-      <w:r>
-        <w:rPr>
-          <w:rFonts w:ascii="MS Gothic" w:eastAsia="MS Gothic" w:hAnsi="MS Gothic" w:cs="MS Gothic" w:hint="eastAsia"/>
-        </w:rPr>
-        <w:t>├</w:t>
-      </w:r>
-      <w:r>
-        <w:rPr>
-          <w:rFonts w:ascii="Calibri" w:hAnsi="Calibri" w:cs="Calibri"/>
-        </w:rPr>
-        <w:t>──</w:t>
-      </w:r>
-      <w:r>
-        <w:t xml:space="preserve"> /get-docs    </w:t>
-      </w:r>
-      <w:r>
-        <w:rPr>
-          <w:rFonts w:ascii="Calibri" w:hAnsi="Calibri" w:cs="Calibri"/>
-        </w:rPr>
-        <w:t>→</w:t>
-      </w:r>
-      <w:r>
-        <w:t xml:space="preserve"> document library</w:t>
-      </w:r>
-    </w:p>
-    <w:p>
-      <w:r>
-        <w:t xml:space="preserve">    └── /preview     → </w:t>
-      </w:r>
-      <w:r>
-        <w:rPr>
-          <w:rFonts w:ascii="Segoe UI Emoji" w:hAnsi="Segoe UI Emoji" w:cs="Segoe UI Emoji"/>
-        </w:rPr>
-        <w:t>🔲</w:t>
-      </w:r>
-      <w:r>
-        <w:t xml:space="preserve"> to build next</w:t>
-      </w:r>
-    </w:p>
-    <w:p/>
-    <w:p>
-      <w:r>
-        <w:t>Indexing Pipeline (indexer.py)</w:t>
-      </w:r>
-    </w:p>
-    <w:p>
-      <w:r>
-        <w:t xml:space="preserve">    </w:t>
-      </w:r>
-      <w:r>
-        <w:rPr>
-          <w:rFonts w:ascii="MS Gothic" w:eastAsia="MS Gothic" w:hAnsi="MS Gothic" w:cs="MS Gothic" w:hint="eastAsia"/>
-        </w:rPr>
-        <w:t>├</w:t>
-      </w:r>
-      <w:r>
-        <w:rPr>
-          <w:rFonts w:ascii="Calibri" w:hAnsi="Calibri" w:cs="Calibri"/>
-        </w:rPr>
-        <w:t>──</w:t>
-      </w:r>
-      <w:r>
-        <w:t xml:space="preserve"> Text extraction</w:t>
-      </w:r>
-    </w:p>
-    <w:p>
-      <w:r>
-        <w:t xml:space="preserve">    </w:t>
-      </w:r>
-      <w:r>
-        <w:rPr>
-          <w:rFonts w:ascii="MS Gothic" w:eastAsia="MS Gothic" w:hAnsi="MS Gothic" w:cs="MS Gothic" w:hint="eastAsia"/>
-        </w:rPr>
-        <w:t>├</w:t>
-      </w:r>
-      <w:r>
-        <w:rPr>
-          <w:rFonts w:ascii="Calibri" w:hAnsi="Calibri" w:cs="Calibri"/>
-        </w:rPr>
-        <w:t>──</w:t>
-      </w:r>
-      <w:r>
-        <w:t xml:space="preserve"> Auto-summary (smart sampling)               </w:t>
-      </w:r>
-      <w:r>
-        <w:rPr>
-          <w:rFonts w:ascii="Segoe UI Emoji" w:hAnsi="Segoe UI Emoji" w:cs="Segoe UI Emoji"/>
-        </w:rPr>
-        <w:t>✅</w:t>
-      </w:r>
-      <w:r>
-        <w:t xml:space="preserve"> built today</w:t>
-      </w:r>
-    </w:p>
-    <w:p>
-      <w:r>
-        <w:t xml:space="preserve">    </w:t>
-      </w:r>
-      <w:r>
-        <w:rPr>
-          <w:rFonts w:ascii="MS Gothic" w:eastAsia="MS Gothic" w:hAnsi="MS Gothic" w:cs="MS Gothic" w:hint="eastAsia"/>
-        </w:rPr>
-        <w:t>├</w:t>
-      </w:r>
-      <w:r>
-        <w:rPr>
-          <w:rFonts w:ascii="Calibri" w:hAnsi="Calibri" w:cs="Calibri"/>
-        </w:rPr>
-        <w:t>──</w:t>
-      </w:r>
-      <w:r>
-        <w:t xml:space="preserve"> Chunking (parent-child)</w:t>
-      </w:r>
-    </w:p>
-    <w:p>
-      <w:r>
-        <w:t xml:space="preserve">    </w:t>
-      </w:r>
-      <w:r>
-        <w:rPr>
-          <w:rFonts w:ascii="MS Gothic" w:eastAsia="MS Gothic" w:hAnsi="MS Gothic" w:cs="MS Gothic" w:hint="eastAsia"/>
-        </w:rPr>
-        <w:t>├</w:t>
-      </w:r>
-      <w:r>
-        <w:rPr>
-          <w:rFonts w:ascii="Calibri" w:hAnsi="Calibri" w:cs="Calibri"/>
-        </w:rPr>
-        <w:t>──</w:t>
-      </w:r>
-      <w:r>
-        <w:t xml:space="preserve"> FTS5 insert</w:t>
-      </w:r>
-    </w:p>
-    <w:p>
-      <w:r>
-        <w:t xml:space="preserve">    </w:t>
-      </w:r>
-      <w:r>
-        <w:rPr>
-          <w:rFonts w:ascii="MS Gothic" w:eastAsia="MS Gothic" w:hAnsi="MS Gothic" w:cs="MS Gothic" w:hint="eastAsia"/>
-        </w:rPr>
-        <w:t>├</w:t>
-      </w:r>
-      <w:r>
-        <w:rPr>
-          <w:rFonts w:ascii="Calibri" w:hAnsi="Calibri" w:cs="Calibri"/>
-        </w:rPr>
-        <w:t>──</w:t>
-      </w:r>
-      <w:r>
-        <w:t xml:space="preserve"> Gemini batch embedding</w:t>
-      </w:r>
-    </w:p>
-    <w:p>
-      <w:r>
-        <w:t xml:space="preserve">    </w:t>
-      </w:r>
-      <w:r>
-        <w:rPr>
-          <w:rFonts w:ascii="MS Gothic" w:eastAsia="MS Gothic" w:hAnsi="MS Gothic" w:cs="MS Gothic" w:hint="eastAsia"/>
-        </w:rPr>
-        <w:t>├</w:t>
-      </w:r>
-      <w:r>
-        <w:rPr>
-          <w:rFonts w:ascii="Calibri" w:hAnsi="Calibri" w:cs="Calibri"/>
-        </w:rPr>
-        <w:t>──</w:t>
-      </w:r>
-      <w:r>
-        <w:t xml:space="preserve"> ChromaDB upsert</w:t>
-      </w:r>
-    </w:p>
-    <w:p>
-      <w:r>
-        <w:t xml:space="preserve">    └── Granular CSV telemetry                      </w:t>
-      </w:r>
-      <w:r>
-        <w:rPr>
-          <w:rFonts w:ascii="Segoe UI Emoji" w:hAnsi="Segoe UI Emoji" w:cs="Segoe UI Emoji"/>
-        </w:rPr>
-        <w:t>✅</w:t>
-      </w:r>
-      <w:r>
-        <w:t xml:space="preserve"> built today</w:t>
-      </w:r>
-    </w:p>
-    <w:p/>
-    <w:p>
-      <w:r>
-        <w:lastRenderedPageBreak/>
-        <w:t>MCP Layer (mcp_server.py)</w:t>
-      </w:r>
-    </w:p>
-    <w:p>
-      <w:r>
-        <w:t xml:space="preserve">    </w:t>
-      </w:r>
-      <w:r>
-        <w:rPr>
-          <w:rFonts w:ascii="MS Gothic" w:eastAsia="MS Gothic" w:hAnsi="MS Gothic" w:cs="MS Gothic" w:hint="eastAsia"/>
-        </w:rPr>
-        <w:t>├</w:t>
-      </w:r>
-      <w:r>
-        <w:rPr>
-          <w:rFonts w:ascii="Calibri" w:hAnsi="Calibri" w:cs="Calibri"/>
-        </w:rPr>
-        <w:t>──</w:t>
-      </w:r>
-      <w:r>
-        <w:t xml:space="preserve"> ask tool                                    </w:t>
-      </w:r>
-      <w:r>
-        <w:rPr>
-          <w:rFonts w:ascii="Segoe UI Emoji" w:hAnsi="Segoe UI Emoji" w:cs="Segoe UI Emoji"/>
-        </w:rPr>
-        <w:t>✅</w:t>
-      </w:r>
-      <w:r>
-        <w:t xml:space="preserve"> live today</w:t>
-      </w:r>
-    </w:p>
-    <w:p>
-      <w:r>
-        <w:t xml:space="preserve">    └── list_documents tool                         </w:t>
-      </w:r>
-      <w:r>
-        <w:rPr>
-          <w:rFonts w:ascii="Segoe UI Emoji" w:hAnsi="Segoe UI Emoji" w:cs="Segoe UI Emoji"/>
-        </w:rPr>
-        <w:t>🔲</w:t>
-      </w:r>
-      <w:r>
-        <w:t xml:space="preserve"> next</w:t>
-      </w:r>
-    </w:p>
-    <w:p>
-      <w:r>
-        <w:pict w14:anchorId="1F453FAA">
-          <v:rect id="_x0000_i1059" style="width:0;height:1.5pt" o:hralign="center" o:hrstd="t" o:hr="t" fillcolor="#a0a0a0" stroked="f"/>
-        </w:pict>
-      </w:r>
-    </w:p>
-    <w:p>
-      <w:r>
-        <w:t>Copy this into your notes doc. Next session start by sharing it and we pick up</w:t>
+        <w:rPr>
+          <w:b/>
+          <w:bCs/>
+        </w:rPr>
+        <w:t xml:space="preserve"> LangSmith observability</w:t>
       </w:r>
     </w:p>
     <w:p/>

</xml_diff>